<commit_message>
Actualización de la documentación en README.md para reflejar mejoras en las funciones y modos de demodulación.
</commit_message>
<xml_diff>
--- a/DOCUMENTACION.docx
+++ b/DOCUMENTACION.docx
@@ -1020,6 +1020,522 @@
           </w:p>
         </w:tc>
       </w:tr>
+      <w:tr>
+        <w:tblPrEx>
+          <w:tblCellMar>
+            <w:top w:w="75" w:type="dxa"/>
+            <w:left w:w="75" w:type="dxa"/>
+            <w:bottom w:w="75" w:type="dxa"/>
+            <w:right w:w="75" w:type="dxa"/>
+          </w:tblCellMar>
+        </w:tblPrEx>
+        <w:trPr>
+          <w:cantSplit/>
+        </w:trPr>
+        <w:tc>
+          <w:tcPr>
+            <w:tcW w:w="1912" w:type="dxa"/>
+            <w:tcBorders>
+              <w:left w:val="single" w:color="D9D9D9" w:sz="6" w:space="0"/>
+              <w:bottom w:val="single" w:color="D9D9D9" w:sz="6" w:space="0"/>
+              <w:right w:val="single" w:color="D9D9D9" w:sz="6" w:space="0"/>
+            </w:tcBorders>
+            <w:vAlign w:val="center"/>
+          </w:tcPr>
+          <w:p>
+            <w:pPr>
+              <w:pStyle w:val="23"/>
+              <w:bidi w:val="0"/>
+              <w:spacing w:before="0" w:after="0" w:line="240" w:lineRule="auto"/>
+              <w:ind w:left="0" w:right="0" w:firstLine="0"/>
+              <w:jc w:val="left"/>
+            </w:pPr>
+            <w:r>
+              <w:fldChar w:fldCharType="begin"/>
+            </w:r>
+            <w:r>
+              <w:instrText xml:space="preserve"> HYPERLINK "demodulador/hardware/stream_transition.py" \h </w:instrText>
+            </w:r>
+            <w:r>
+              <w:fldChar w:fldCharType="separate"/>
+            </w:r>
+            <w:r>
+              <w:rPr>
+                <w:rStyle w:val="9"/>
+                <w:sz w:val="18"/>
+                <w:szCs w:val="18"/>
+              </w:rPr>
+              <w:t>hardware/stream_transition.py</w:t>
+            </w:r>
+            <w:r>
+              <w:rPr>
+                <w:rStyle w:val="9"/>
+                <w:sz w:val="18"/>
+                <w:szCs w:val="18"/>
+              </w:rPr>
+              <w:fldChar w:fldCharType="end"/>
+            </w:r>
+          </w:p>
+        </w:tc>
+        <w:tc>
+          <w:tcPr>
+            <w:tcW w:w="5737" w:type="dxa"/>
+            <w:tcBorders>
+              <w:left w:val="single" w:color="D9D9D9" w:sz="2" w:space="0"/>
+              <w:bottom w:val="single" w:color="D9D9D9" w:sz="6" w:space="0"/>
+              <w:right w:val="single" w:color="D9D9D9" w:sz="6" w:space="0"/>
+            </w:tcBorders>
+            <w:vAlign w:val="center"/>
+          </w:tcPr>
+          <w:p>
+            <w:pPr>
+              <w:pStyle w:val="23"/>
+              <w:bidi w:val="0"/>
+              <w:spacing w:before="0" w:after="0" w:line="240" w:lineRule="auto"/>
+              <w:jc w:val="left"/>
+            </w:pPr>
+            <w:r>
+              <w:rPr>
+                <w:sz w:val="18"/>
+                <w:szCs w:val="18"/>
+              </w:rPr>
+              <w:t>Pausa y reanuda la recepción de los SDR físicos mediante @receiver_transition durante cambios de configuración anidados.</w:t>
+            </w:r>
+          </w:p>
+        </w:tc>
+      </w:tr>
+      <w:tr>
+        <w:tblPrEx>
+          <w:tblCellMar>
+            <w:top w:w="75" w:type="dxa"/>
+            <w:left w:w="75" w:type="dxa"/>
+            <w:bottom w:w="75" w:type="dxa"/>
+            <w:right w:w="75" w:type="dxa"/>
+          </w:tblCellMar>
+        </w:tblPrEx>
+        <w:trPr>
+          <w:cantSplit/>
+        </w:trPr>
+        <w:tc>
+          <w:tcPr>
+            <w:tcW w:w="1912" w:type="dxa"/>
+            <w:tcBorders>
+              <w:left w:val="single" w:color="D9D9D9" w:sz="6" w:space="0"/>
+              <w:bottom w:val="single" w:color="D9D9D9" w:sz="6" w:space="0"/>
+              <w:right w:val="single" w:color="D9D9D9" w:sz="6" w:space="0"/>
+            </w:tcBorders>
+            <w:vAlign w:val="center"/>
+          </w:tcPr>
+          <w:p>
+            <w:pPr>
+              <w:pStyle w:val="23"/>
+              <w:bidi w:val="0"/>
+              <w:spacing w:before="0" w:after="0" w:line="240" w:lineRule="auto"/>
+              <w:ind w:left="0" w:right="0" w:firstLine="0"/>
+              <w:jc w:val="left"/>
+            </w:pPr>
+            <w:r>
+              <w:fldChar w:fldCharType="begin"/>
+            </w:r>
+            <w:r>
+              <w:instrText xml:space="preserve"> HYPERLINK "demodulador/iq_ring_buffer.py" \h </w:instrText>
+            </w:r>
+            <w:r>
+              <w:fldChar w:fldCharType="separate"/>
+            </w:r>
+            <w:r>
+              <w:rPr>
+                <w:rStyle w:val="9"/>
+                <w:sz w:val="18"/>
+                <w:szCs w:val="18"/>
+              </w:rPr>
+              <w:t>iq_ring_buffer.py</w:t>
+            </w:r>
+            <w:r>
+              <w:rPr>
+                <w:rStyle w:val="9"/>
+                <w:sz w:val="18"/>
+                <w:szCs w:val="18"/>
+              </w:rPr>
+              <w:fldChar w:fldCharType="end"/>
+            </w:r>
+          </w:p>
+        </w:tc>
+        <w:tc>
+          <w:tcPr>
+            <w:tcW w:w="5737" w:type="dxa"/>
+            <w:tcBorders>
+              <w:left w:val="single" w:color="D9D9D9" w:sz="2" w:space="0"/>
+              <w:bottom w:val="single" w:color="D9D9D9" w:sz="6" w:space="0"/>
+              <w:right w:val="single" w:color="D9D9D9" w:sz="6" w:space="0"/>
+            </w:tcBorders>
+            <w:vAlign w:val="center"/>
+          </w:tcPr>
+          <w:p>
+            <w:pPr>
+              <w:pStyle w:val="23"/>
+              <w:bidi w:val="0"/>
+              <w:spacing w:before="0" w:after="0" w:line="240" w:lineRule="auto"/>
+              <w:jc w:val="left"/>
+            </w:pPr>
+            <w:r>
+              <w:rPr>
+                <w:sz w:val="18"/>
+                <w:szCs w:val="18"/>
+              </w:rPr>
+              <w:t>Buffer circular sincronizado (IQRingBuffer) que conserva el historial de muestras del espectrograma para recortes retrospectivos.</w:t>
+            </w:r>
+          </w:p>
+        </w:tc>
+      </w:tr>
+      <w:tr>
+        <w:tblPrEx>
+          <w:tblCellMar>
+            <w:top w:w="75" w:type="dxa"/>
+            <w:left w:w="75" w:type="dxa"/>
+            <w:bottom w:w="75" w:type="dxa"/>
+            <w:right w:w="75" w:type="dxa"/>
+          </w:tblCellMar>
+        </w:tblPrEx>
+        <w:trPr>
+          <w:cantSplit/>
+        </w:trPr>
+        <w:tc>
+          <w:tcPr>
+            <w:tcW w:w="1912" w:type="dxa"/>
+            <w:tcBorders>
+              <w:left w:val="single" w:color="D9D9D9" w:sz="6" w:space="0"/>
+              <w:bottom w:val="single" w:color="D9D9D9" w:sz="6" w:space="0"/>
+              <w:right w:val="single" w:color="D9D9D9" w:sz="6" w:space="0"/>
+            </w:tcBorders>
+            <w:vAlign w:val="center"/>
+          </w:tcPr>
+          <w:p>
+            <w:pPr>
+              <w:pStyle w:val="23"/>
+              <w:bidi w:val="0"/>
+              <w:spacing w:before="0" w:after="0" w:line="240" w:lineRule="auto"/>
+              <w:ind w:left="0" w:right="0" w:firstLine="0"/>
+              <w:jc w:val="left"/>
+            </w:pPr>
+            <w:r>
+              <w:fldChar w:fldCharType="begin"/>
+            </w:r>
+            <w:r>
+              <w:instrText xml:space="preserve"> HYPERLINK "demodulador/trace_manager.py" \h </w:instrText>
+            </w:r>
+            <w:r>
+              <w:fldChar w:fldCharType="separate"/>
+            </w:r>
+            <w:r>
+              <w:rPr>
+                <w:rStyle w:val="9"/>
+                <w:sz w:val="18"/>
+                <w:szCs w:val="18"/>
+              </w:rPr>
+              <w:t>trace_manager.py</w:t>
+            </w:r>
+            <w:r>
+              <w:rPr>
+                <w:rStyle w:val="9"/>
+                <w:sz w:val="18"/>
+                <w:szCs w:val="18"/>
+              </w:rPr>
+              <w:fldChar w:fldCharType="end"/>
+            </w:r>
+            <w:r>
+              <w:rPr>
+                <w:sz w:val="18"/>
+                <w:szCs w:val="18"/>
+              </w:rPr>
+              <w:t xml:space="preserve"> y </w:t>
+            </w:r>
+            <w:r>
+              <w:fldChar w:fldCharType="begin"/>
+            </w:r>
+            <w:r>
+              <w:instrText xml:space="preserve"> HYPERLINK "demodulador/marker_manager.py" \h </w:instrText>
+            </w:r>
+            <w:r>
+              <w:fldChar w:fldCharType="separate"/>
+            </w:r>
+            <w:r>
+              <w:rPr>
+                <w:rStyle w:val="9"/>
+                <w:sz w:val="18"/>
+                <w:szCs w:val="18"/>
+              </w:rPr>
+              <w:t>marker_manager.py</w:t>
+            </w:r>
+            <w:r>
+              <w:rPr>
+                <w:rStyle w:val="9"/>
+                <w:sz w:val="18"/>
+                <w:szCs w:val="18"/>
+              </w:rPr>
+              <w:fldChar w:fldCharType="end"/>
+            </w:r>
+          </w:p>
+        </w:tc>
+        <w:tc>
+          <w:tcPr>
+            <w:tcW w:w="5737" w:type="dxa"/>
+            <w:tcBorders>
+              <w:left w:val="single" w:color="D9D9D9" w:sz="2" w:space="0"/>
+              <w:bottom w:val="single" w:color="D9D9D9" w:sz="6" w:space="0"/>
+              <w:right w:val="single" w:color="D9D9D9" w:sz="6" w:space="0"/>
+            </w:tcBorders>
+            <w:vAlign w:val="center"/>
+          </w:tcPr>
+          <w:p>
+            <w:pPr>
+              <w:pStyle w:val="23"/>
+              <w:bidi w:val="0"/>
+              <w:spacing w:before="0" w:after="0" w:line="240" w:lineRule="auto"/>
+              <w:jc w:val="left"/>
+            </w:pPr>
+            <w:r>
+              <w:rPr>
+                <w:sz w:val="18"/>
+                <w:szCs w:val="18"/>
+              </w:rPr>
+              <w:t>Administran hasta 4 trazas (Clear &amp; Write, Max Hold, Min Hold, Average) y hasta 6 marcadores (Normal, Delta, Peak Search, Next Peak, Track Peak) tanto en RF como en el espectro MPX FM.</w:t>
+            </w:r>
+          </w:p>
+        </w:tc>
+      </w:tr>
+      <w:tr>
+        <w:tblPrEx>
+          <w:tblCellMar>
+            <w:top w:w="75" w:type="dxa"/>
+            <w:left w:w="75" w:type="dxa"/>
+            <w:bottom w:w="75" w:type="dxa"/>
+            <w:right w:w="75" w:type="dxa"/>
+          </w:tblCellMar>
+        </w:tblPrEx>
+        <w:trPr>
+          <w:cantSplit/>
+        </w:trPr>
+        <w:tc>
+          <w:tcPr>
+            <w:tcW w:w="1912" w:type="dxa"/>
+            <w:tcBorders>
+              <w:left w:val="single" w:color="D9D9D9" w:sz="6" w:space="0"/>
+              <w:bottom w:val="single" w:color="D9D9D9" w:sz="6" w:space="0"/>
+              <w:right w:val="single" w:color="D9D9D9" w:sz="6" w:space="0"/>
+            </w:tcBorders>
+            <w:vAlign w:val="center"/>
+          </w:tcPr>
+          <w:p>
+            <w:pPr>
+              <w:pStyle w:val="23"/>
+              <w:bidi w:val="0"/>
+              <w:spacing w:before="0" w:after="0" w:line="240" w:lineRule="auto"/>
+              <w:ind w:left="0" w:right="0" w:firstLine="0"/>
+              <w:jc w:val="left"/>
+            </w:pPr>
+            <w:r>
+              <w:fldChar w:fldCharType="begin"/>
+            </w:r>
+            <w:r>
+              <w:instrText xml:space="preserve"> HYPERLINK "demodulador/btle_history.py" \h </w:instrText>
+            </w:r>
+            <w:r>
+              <w:fldChar w:fldCharType="separate"/>
+            </w:r>
+            <w:r>
+              <w:rPr>
+                <w:rStyle w:val="9"/>
+                <w:sz w:val="18"/>
+                <w:szCs w:val="18"/>
+              </w:rPr>
+              <w:t>btle_history.py</w:t>
+            </w:r>
+            <w:r>
+              <w:rPr>
+                <w:rStyle w:val="9"/>
+                <w:sz w:val="18"/>
+                <w:szCs w:val="18"/>
+              </w:rPr>
+              <w:fldChar w:fldCharType="end"/>
+            </w:r>
+            <w:r>
+              <w:rPr>
+                <w:sz w:val="18"/>
+                <w:szCs w:val="18"/>
+              </w:rPr>
+              <w:t xml:space="preserve"> y </w:t>
+            </w:r>
+            <w:r>
+              <w:fldChar w:fldCharType="begin"/>
+            </w:r>
+            <w:r>
+              <w:instrText xml:space="preserve"> HYPERLINK "demodulador/dsp/demoduladores/btle_frames.py" \h </w:instrText>
+            </w:r>
+            <w:r>
+              <w:fldChar w:fldCharType="separate"/>
+            </w:r>
+            <w:r>
+              <w:rPr>
+                <w:rStyle w:val="9"/>
+                <w:sz w:val="18"/>
+                <w:szCs w:val="18"/>
+              </w:rPr>
+              <w:t>btle_frames.py</w:t>
+            </w:r>
+            <w:r>
+              <w:rPr>
+                <w:rStyle w:val="9"/>
+                <w:sz w:val="18"/>
+                <w:szCs w:val="18"/>
+              </w:rPr>
+              <w:fldChar w:fldCharType="end"/>
+            </w:r>
+          </w:p>
+        </w:tc>
+        <w:tc>
+          <w:tcPr>
+            <w:tcW w:w="5737" w:type="dxa"/>
+            <w:tcBorders>
+              <w:left w:val="single" w:color="D9D9D9" w:sz="2" w:space="0"/>
+              <w:bottom w:val="single" w:color="D9D9D9" w:sz="6" w:space="0"/>
+              <w:right w:val="single" w:color="D9D9D9" w:sz="6" w:space="0"/>
+            </w:tcBorders>
+            <w:vAlign w:val="center"/>
+          </w:tcPr>
+          <w:p>
+            <w:pPr>
+              <w:pStyle w:val="23"/>
+              <w:bidi w:val="0"/>
+              <w:spacing w:before="0" w:after="0" w:line="240" w:lineRule="auto"/>
+              <w:jc w:val="left"/>
+            </w:pPr>
+            <w:r>
+              <w:rPr>
+                <w:sz w:val="18"/>
+                <w:szCs w:val="18"/>
+              </w:rPr>
+              <w:t>Decodifican anuncios BLE legacy (PDUs, estructuras AD, dewhitening y CRC-24), deduplican direcciones y mantienen el historial de paquetes.</w:t>
+            </w:r>
+          </w:p>
+        </w:tc>
+      </w:tr>
+      <w:tr>
+        <w:tblPrEx>
+          <w:tblCellMar>
+            <w:top w:w="75" w:type="dxa"/>
+            <w:left w:w="75" w:type="dxa"/>
+            <w:bottom w:w="75" w:type="dxa"/>
+            <w:right w:w="75" w:type="dxa"/>
+          </w:tblCellMar>
+        </w:tblPrEx>
+        <w:trPr>
+          <w:cantSplit/>
+        </w:trPr>
+        <w:tc>
+          <w:tcPr>
+            <w:tcW w:w="1912" w:type="dxa"/>
+            <w:tcBorders>
+              <w:left w:val="single" w:color="D9D9D9" w:sz="6" w:space="0"/>
+              <w:bottom w:val="single" w:color="D9D9D9" w:sz="6" w:space="0"/>
+              <w:right w:val="single" w:color="D9D9D9" w:sz="6" w:space="0"/>
+            </w:tcBorders>
+            <w:vAlign w:val="center"/>
+          </w:tcPr>
+          <w:p>
+            <w:pPr>
+              <w:pStyle w:val="23"/>
+              <w:bidi w:val="0"/>
+              <w:spacing w:before="0" w:after="0" w:line="240" w:lineRule="auto"/>
+              <w:ind w:left="0" w:right="0" w:firstLine="0"/>
+              <w:jc w:val="left"/>
+            </w:pPr>
+            <w:r>
+              <w:fldChar w:fldCharType="begin"/>
+            </w:r>
+            <w:r>
+              <w:instrText xml:space="preserve"> HYPERLINK "demodulador/dsp/rds.py" \h </w:instrText>
+            </w:r>
+            <w:r>
+              <w:fldChar w:fldCharType="separate"/>
+            </w:r>
+            <w:r>
+              <w:rPr>
+                <w:rStyle w:val="9"/>
+                <w:sz w:val="18"/>
+                <w:szCs w:val="18"/>
+              </w:rPr>
+              <w:t>dsp/rds.py</w:t>
+            </w:r>
+            <w:r>
+              <w:rPr>
+                <w:rStyle w:val="9"/>
+                <w:sz w:val="18"/>
+                <w:szCs w:val="18"/>
+              </w:rPr>
+              <w:fldChar w:fldCharType="end"/>
+            </w:r>
+            <w:r>
+              <w:rPr>
+                <w:sz w:val="18"/>
+                <w:szCs w:val="18"/>
+              </w:rPr>
+              <w:t xml:space="preserve"> y </w:t>
+            </w:r>
+            <w:r>
+              <w:fldChar w:fldCharType="begin"/>
+            </w:r>
+            <w:r>
+              <w:instrText xml:space="preserve"> HYPERLINK "demodulador/dsp/streaming_resampler.py" \h </w:instrText>
+            </w:r>
+            <w:r>
+              <w:fldChar w:fldCharType="separate"/>
+            </w:r>
+            <w:r>
+              <w:rPr>
+                <w:rStyle w:val="9"/>
+                <w:sz w:val="18"/>
+                <w:szCs w:val="18"/>
+              </w:rPr>
+              <w:t>dsp/streaming_resampler.py</w:t>
+            </w:r>
+            <w:r>
+              <w:rPr>
+                <w:rStyle w:val="9"/>
+                <w:sz w:val="18"/>
+                <w:szCs w:val="18"/>
+              </w:rPr>
+              <w:fldChar w:fldCharType="end"/>
+            </w:r>
+          </w:p>
+        </w:tc>
+        <w:tc>
+          <w:tcPr>
+            <w:tcW w:w="5737" w:type="dxa"/>
+            <w:tcBorders>
+              <w:left w:val="single" w:color="D9D9D9" w:sz="2" w:space="0"/>
+              <w:bottom w:val="single" w:color="D9D9D9" w:sz="6" w:space="0"/>
+              <w:right w:val="single" w:color="D9D9D9" w:sz="6" w:space="0"/>
+            </w:tcBorders>
+            <w:vAlign w:val="center"/>
+          </w:tcPr>
+          <w:p>
+            <w:pPr>
+              <w:pStyle w:val="23"/>
+              <w:bidi w:val="0"/>
+              <w:spacing w:before="0" w:after="0" w:line="240" w:lineRule="auto"/>
+              <w:jc w:val="left"/>
+            </w:pPr>
+            <w:r>
+              <w:rPr>
+                <w:sz w:val="18"/>
+                <w:szCs w:val="18"/>
+              </w:rPr>
+              <w:t>Decodificador RDS de 57 kHz (PLL, síndrome CRC de 10 bits, grupos 0A/0B y 2A/2B) y remuestreador polifásico con preservación de estado entre bloques.</w:t>
+            </w:r>
+          </w:p>
+        </w:tc>
+      </w:tr>
     </w:tbl>
     <w:p>
       <w:pPr>
@@ -1126,7 +1642,7 @@
         <w:jc w:val="left"/>
       </w:pPr>
       <w:r>
-        <w:t>La frecuencia central y la tasa de muestreo forman parte del estado de la sesión. Al abrir una captura, se toman de sus metadatos para crear un procesador nuevo. Al terminar, se restablecen los valores y el procesador de la recepción en vivo. Un corte de IQ reinicia el estado DSP. Al resintonizar, FM crea un procesador nuevo y LoRa reinicia su flujo; otros modos aplican su propia actualización de frecuencia.</w:t>
+        <w:t>La frecuencia central y la tasa de muestreo forman parte del estado de la sesión. Al abrir una captura, se toman de sus metadatos para crear un procesador nuevo. Al terminar, se restablecen los valores y el procesador de la recepción en vivo. Un corte de IQ reinicia el estado DSP. Al resintonizar o cambiar la tasa de muestreo, todos los modos reinician su flujo mediante reset_demodulator_stream, descartando muestras y trabajadores en vuelo pero conservando la configuración del modo (incluyendo el canal BLE y el estado de barrido LTE Uplink).</w:t>
       </w:r>
     </w:p>
     <w:p>
@@ -1881,7 +2397,7 @@
                 <w:sz w:val="18"/>
                 <w:szCs w:val="18"/>
               </w:rPr>
-              <w:t>Tramas LoRa de capa física; no implementa LoRaWAN ni OTAA.</w:t>
+              <w:t>Análisis de tramas LoRa de la capa física.</w:t>
             </w:r>
           </w:p>
         </w:tc>
@@ -2020,7 +2536,7 @@
         <w:fldChar w:fldCharType="end"/>
       </w:r>
       <w:r>
-        <w:t xml:space="preserve"> calcula la potencia espectral del IQ. La interfaz agrega espectrograma, trazas, marcadores y controles de vista. Es el modo de entrada para ubicar una señal antes de elegir un demodulador.</w:t>
+        <w:t xml:space="preserve"> calcula la potencia espectral del IQ con tamaños de FFT de 1024 a 65536 puntos, indicación de RBW y ventanas seleccionables (Rectangular, Hanning, Hamming, Blackman, Blackman-Harris y Flat Top). La interfaz agrega espectrograma, hasta 4 trazas simultáneas (Clear &amp; Write, Max Hold, Min Hold, Average) y hasta 6 marcadores (Normal, Delta, Peak Search, Next Peak y Track Peak).</w:t>
       </w:r>
     </w:p>
     <w:p>
@@ -2114,7 +2630,7 @@
         <w:fldChar w:fldCharType="end"/>
       </w:r>
       <w:r>
-        <w:t>, que genera la salida a 48 kHz. Si no detecta un piloto estéreo utilizable, la ruta de escucha entrega mono a ambos canales.</w:t>
+        <w:t>, que genera la salida a 48 kHz con selección de desénfasis (75 µs / 50 µs). Si no detecta un piloto estéreo utilizable, la ruta de escucha entrega mono a ambos canales. El panel informa desviación pico máxima, mínima y RMS (kHz), offset DC, nivel de piloto de 19 kHz (dB), enganche del PLL de 38 kHz y porcentaje de stereo blend, además de admitir marcadores sobre el espectro multiplex MPX.</w:t>
       </w:r>
     </w:p>
     <w:p>
@@ -2191,7 +2707,7 @@
         <w:fldChar w:fldCharType="end"/>
       </w:r>
       <w:r>
-        <w:t xml:space="preserve"> detecta el preámbulo, ajusta tiempo y desplazamiento de frecuencia con las secuencias STS/LTS, estima el canal y decodifica el campo SIGNAL. Muestra métricas OFDM, constelación y EVM de los símbolos procesados. La ruta está centrada en tramas legacy 802.11a/g; una ráfaga HT mixed se descarta y el detector continúa buscando la siguiente trama legacy.</w:t>
+        <w:t xml:space="preserve"> detecta el preámbulo, ajusta tiempo y desplazamiento de frecuencia con las secuencias STS/LTS, estima el canal y decodifica el campo SIGNAL. Muestra métricas de CFO (kHz), SNR (dB), EVM RMS (% y dB), constelación ecualizada y los campos decodificados del símbolo SIGNAL (esquema de modulación, tasa en Mbps y longitud de PSDU). La ruta está centrada en tramas legacy 802.11a/g; una ráfaga HT mixed se descarta y el detector continúa buscando la siguiente trama legacy.</w:t>
       </w:r>
     </w:p>
     <w:p>
@@ -2258,7 +2774,7 @@
         <w:fldChar w:fldCharType="end"/>
       </w:r>
       <w:r>
-        <w:t xml:space="preserve"> interpreta anuncios legacy de los canales primarios, aplica dewhitening y verifica CRC-24 antes de publicarlos. La interfaz conserva un historial de paquetes y una vista de campos legibles cuando corresponde. La vista LE 2M se limita a métricas de la capa física.</w:t>
+        <w:t xml:space="preserve"> interpreta anuncios legacy de los canales primarios, aplica dewhitening y verifica CRC-24 antes de publicarlos. Calcula las métricas de desviación de frecuencia GFSK (df_avg, f1_avg, f2_avg, relación f2/f1, desviación RMS y CFO) e identifica automáticamente el canal primario de advertising (37, 38 o 39) a partir de la frecuencia central para inicializar el LFSR de dewhitening. La interfaz conserva un historial deduplicado de paquetes y una vista de estructuras AD legibles. La vista LE 2M se limita a métricas de la capa física.</w:t>
       </w:r>
     </w:p>
     <w:p>
@@ -2325,7 +2841,7 @@
         <w:fldChar w:fldCharType="end"/>
       </w:r>
       <w:r>
-        <w:t>. El núcleo busca preámbulo y sync word, corrige desplazamientos de tiempo y frecuencia, y reconstruye el encabezado explícito y la carga útil. Informa el CRC de payload cuando la trama lo incluye. La interfaz permite BW de 125, 250 o 500 kHz y SF7 a SF12. Los bytes reconstruidos son de la trama física; el módulo no gestiona claves, join, MAC ni servidores LoRaWAN.</w:t>
+        <w:t>. El núcleo busca preámbulo y sync word, corrige desplazamientos de tiempo y frecuencia, y reconstruye el encabezado explícito y la carga útil. Reporta CFO, SNR, RSSI, Spreading Factor (SF7 a SF12), Coding Rate (CR), Sync Word, longitud de payload y validación del CRC de encabezado y de carga útil. La interfaz permite BW de 125, 250 o 500 kHz y SF7 a SF12. Los bytes reconstruidos corresponden directamente a la trama de la capa física.</w:t>
       </w:r>
     </w:p>
     <w:p>
@@ -2392,7 +2908,7 @@
         <w:fldChar w:fldCharType="end"/>
       </w:r>
       <w:r>
-        <w:t xml:space="preserve"> usa la información de sincronización disponible y analiza recursos uplink, incluidas referencias DMRS y regiones PUSCH. La selección de ancho de banda y tasa depende de la SDR. Estas vistas sirven para inspección física; no reconstruyen una sesión de datos LTE de extremo a extremo.</w:t>
+        <w:t xml:space="preserve"> identifica automáticamente la banda FDD 3GPP y el par de frecuencia Uplink a partir de la portadora Downlink, operando en dos etapas (SEARCHING_DL → WAITING_UL): primero adquiere el N_ID_cell mediante PSS/SSS en Downlink y luego conmuta automáticamente la sintonía del SDR a la frecuencia Uplink conservando la Cell ID para generar las secuencias DMRS y demodular PUSCH. En Downlink se detectan ciegamente 1, 2 o 4 puertos de antena TX por máscara CRC de PBCH (con combinación Alamouti SFBC), se decodifica el MIB (N_RB_DL, SFN, PHICH) y se reportan CFO, SNR, RSRP, RSRQ, RSSI y EVM por canal (PBCH, PDCCH, PDSCH / DMRS, PUSCH). Estas vistas sirven para inspección física; no reconstruyen una sesión de datos LTE de extremo a extremo.</w:t>
       </w:r>
     </w:p>
     <w:p>
@@ -2417,6 +2933,499 @@
         <w:t>La interfaz solicita 2,4 Ms/s para FM con RTL-SDR y 3 Ms/s para FM con otros equipos; LoRa usa 2 Ms/s, y WiFi y BLE solicitan 20 Ms/s. LTE selecciona la tasa según el ancho de banda y las capacidades del equipo. Al reproducir un archivo, el procesador toma la tasa de los metadatos de esa captura. Elegir un modo no hace que una SDR admita tasas fuera de sus capacidades.</w:t>
       </w:r>
     </w:p>
+    <w:p>
+      <w:pPr>
+        <w:pStyle w:val="6"/>
+        <w:keepNext/>
+        <w:keepLines/>
+        <w:bidi w:val="0"/>
+        <w:jc w:val="left"/>
+      </w:pPr>
+      <w:r>
+        <w:t>Compatibilidad por SDR y controles de ganancia</w:t>
+      </w:r>
+    </w:p>
+    <w:tbl>
+      <w:tblPr>
+        <w:tblStyle w:val="8"/>
+        <w:tblW w:w="7650" w:type="dxa"/>
+        <w:tblInd w:w="-7" w:type="dxa"/>
+        <w:tblLayout w:type="fixed"/>
+        <w:tblCellMar>
+          <w:top w:w="75" w:type="dxa"/>
+          <w:left w:w="75" w:type="dxa"/>
+          <w:bottom w:w="75" w:type="dxa"/>
+          <w:right w:w="75" w:type="dxa"/>
+        </w:tblCellMar>
+      </w:tblPr>
+      <w:tblGrid>
+        <w:gridCol w:w="1453"/>
+        <w:gridCol w:w="2524"/>
+        <w:gridCol w:w="3671"/>
+      </w:tblGrid>
+      <w:tr>
+        <w:tblPrEx>
+          <w:tblCellMar>
+            <w:top w:w="75" w:type="dxa"/>
+            <w:left w:w="75" w:type="dxa"/>
+            <w:bottom w:w="75" w:type="dxa"/>
+            <w:right w:w="75" w:type="dxa"/>
+          </w:tblCellMar>
+        </w:tblPrEx>
+        <w:trPr>
+          <w:cantSplit/>
+          <w:tblHeader/>
+        </w:trPr>
+        <w:tc>
+          <w:tcPr>
+            <w:tcW w:w="1453" w:type="dxa"/>
+            <w:tcBorders>
+              <w:top w:val="single" w:color="D9D9D9" w:sz="6" w:space="0"/>
+              <w:left w:val="single" w:color="D9D9D9" w:sz="6" w:space="0"/>
+              <w:bottom w:val="single" w:color="D9D9D9" w:sz="2" w:space="0"/>
+              <w:right w:val="single" w:color="D9D9D9" w:sz="6" w:space="0"/>
+            </w:tcBorders>
+            <w:vAlign w:val="center"/>
+          </w:tcPr>
+          <w:p>
+            <w:pPr>
+              <w:pStyle w:val="27"/>
+              <w:bidi w:val="0"/>
+              <w:spacing w:before="0" w:after="0" w:line="240" w:lineRule="auto"/>
+              <w:jc w:val="left"/>
+            </w:pPr>
+            <w:r>
+              <w:rPr>
+                <w:rStyle w:val="11"/>
+                <w:sz w:val="18"/>
+                <w:szCs w:val="18"/>
+              </w:rPr>
+              <w:t>Equipo SDR</w:t>
+            </w:r>
+          </w:p>
+        </w:tc>
+        <w:tc>
+          <w:tcPr>
+            <w:tcW w:w="2524" w:type="dxa"/>
+            <w:tcBorders>
+              <w:top w:val="single" w:color="D9D9D9" w:sz="6" w:space="0"/>
+              <w:left w:val="single" w:color="D9D9D9" w:sz="2" w:space="0"/>
+              <w:bottom w:val="single" w:color="D9D9D9" w:sz="2" w:space="0"/>
+              <w:right w:val="single" w:color="D9D9D9" w:sz="6" w:space="0"/>
+            </w:tcBorders>
+            <w:vAlign w:val="center"/>
+          </w:tcPr>
+          <w:p>
+            <w:pPr>
+              <w:pStyle w:val="27"/>
+              <w:bidi w:val="0"/>
+              <w:spacing w:before="0" w:after="0" w:line="240" w:lineRule="auto"/>
+              <w:jc w:val="left"/>
+            </w:pPr>
+            <w:r>
+              <w:rPr>
+                <w:rStyle w:val="11"/>
+                <w:sz w:val="18"/>
+                <w:szCs w:val="18"/>
+              </w:rPr>
+              <w:t>Tasa máx. y modos en vivo</w:t>
+            </w:r>
+          </w:p>
+        </w:tc>
+        <w:tc>
+          <w:tcPr>
+            <w:tcW w:w="3671" w:type="dxa"/>
+            <w:tcBorders>
+              <w:top w:val="single" w:color="D9D9D9" w:sz="6" w:space="0"/>
+              <w:left w:val="single" w:color="D9D9D9" w:sz="2" w:space="0"/>
+              <w:bottom w:val="single" w:color="D9D9D9" w:sz="2" w:space="0"/>
+              <w:right w:val="single" w:color="D9D9D9" w:sz="6" w:space="0"/>
+            </w:tcBorders>
+            <w:vAlign w:val="center"/>
+          </w:tcPr>
+          <w:p>
+            <w:pPr>
+              <w:pStyle w:val="27"/>
+              <w:bidi w:val="0"/>
+              <w:spacing w:before="0" w:after="0" w:line="240" w:lineRule="auto"/>
+              <w:jc w:val="left"/>
+            </w:pPr>
+            <w:r>
+              <w:rPr>
+                <w:rStyle w:val="11"/>
+                <w:sz w:val="18"/>
+                <w:szCs w:val="18"/>
+              </w:rPr>
+              <w:t>Controles de ganancia en la interfaz</w:t>
+            </w:r>
+          </w:p>
+        </w:tc>
+      </w:tr>
+      <w:tr>
+        <w:tblPrEx>
+          <w:tblCellMar>
+            <w:top w:w="75" w:type="dxa"/>
+            <w:left w:w="75" w:type="dxa"/>
+            <w:bottom w:w="75" w:type="dxa"/>
+            <w:right w:w="75" w:type="dxa"/>
+          </w:tblCellMar>
+        </w:tblPrEx>
+        <w:trPr>
+          <w:cantSplit/>
+        </w:trPr>
+        <w:tc>
+          <w:tcPr>
+            <w:tcW w:w="1453" w:type="dxa"/>
+            <w:tcBorders>
+              <w:left w:val="single" w:color="D9D9D9" w:sz="6" w:space="0"/>
+              <w:bottom w:val="single" w:color="D9D9D9" w:sz="6" w:space="0"/>
+              <w:right w:val="single" w:color="D9D9D9" w:sz="6" w:space="0"/>
+            </w:tcBorders>
+            <w:vAlign w:val="center"/>
+          </w:tcPr>
+          <w:p>
+            <w:pPr>
+              <w:pStyle w:val="23"/>
+              <w:bidi w:val="0"/>
+              <w:spacing w:before="0" w:after="0" w:line="240" w:lineRule="auto"/>
+              <w:jc w:val="left"/>
+            </w:pPr>
+            <w:r>
+              <w:rPr>
+                <w:sz w:val="18"/>
+                <w:szCs w:val="18"/>
+              </w:rPr>
+              <w:t>HackRF One</w:t>
+            </w:r>
+          </w:p>
+        </w:tc>
+        <w:tc>
+          <w:tcPr>
+            <w:tcW w:w="2524" w:type="dxa"/>
+            <w:tcBorders>
+              <w:left w:val="single" w:color="D9D9D9" w:sz="2" w:space="0"/>
+              <w:bottom w:val="single" w:color="D9D9D9" w:sz="6" w:space="0"/>
+              <w:right w:val="single" w:color="D9D9D9" w:sz="6" w:space="0"/>
+            </w:tcBorders>
+            <w:vAlign w:val="center"/>
+          </w:tcPr>
+          <w:p>
+            <w:pPr>
+              <w:pStyle w:val="23"/>
+              <w:bidi w:val="0"/>
+              <w:spacing w:before="0" w:after="0" w:line="240" w:lineRule="auto"/>
+              <w:jc w:val="left"/>
+            </w:pPr>
+            <w:r>
+              <w:rPr>
+                <w:sz w:val="18"/>
+                <w:szCs w:val="18"/>
+              </w:rPr>
+              <w:t>Hasta 20 Ms/s — Todos los modos (SA, FM, LoRa, WiFi, BLE, LTE).</w:t>
+            </w:r>
+          </w:p>
+        </w:tc>
+        <w:tc>
+          <w:tcPr>
+            <w:tcW w:w="3671" w:type="dxa"/>
+            <w:tcBorders>
+              <w:left w:val="single" w:color="D9D9D9" w:sz="2" w:space="0"/>
+              <w:bottom w:val="single" w:color="D9D9D9" w:sz="6" w:space="0"/>
+              <w:right w:val="single" w:color="D9D9D9" w:sz="6" w:space="0"/>
+            </w:tcBorders>
+            <w:vAlign w:val="center"/>
+          </w:tcPr>
+          <w:p>
+            <w:pPr>
+              <w:pStyle w:val="23"/>
+              <w:bidi w:val="0"/>
+              <w:spacing w:before="0" w:after="0" w:line="240" w:lineRule="auto"/>
+              <w:jc w:val="left"/>
+            </w:pPr>
+            <w:r>
+              <w:rPr>
+                <w:sz w:val="18"/>
+                <w:szCs w:val="18"/>
+              </w:rPr>
+              <w:t>Etapas independientes LNA (0–40 dB), VGA (0–62 dB) y amplificador RF AMP.</w:t>
+            </w:r>
+          </w:p>
+        </w:tc>
+      </w:tr>
+      <w:tr>
+        <w:tblPrEx>
+          <w:tblCellMar>
+            <w:top w:w="75" w:type="dxa"/>
+            <w:left w:w="75" w:type="dxa"/>
+            <w:bottom w:w="75" w:type="dxa"/>
+            <w:right w:w="75" w:type="dxa"/>
+          </w:tblCellMar>
+        </w:tblPrEx>
+        <w:trPr>
+          <w:cantSplit/>
+        </w:trPr>
+        <w:tc>
+          <w:tcPr>
+            <w:tcW w:w="1453" w:type="dxa"/>
+            <w:tcBorders>
+              <w:left w:val="single" w:color="D9D9D9" w:sz="6" w:space="0"/>
+              <w:bottom w:val="single" w:color="D9D9D9" w:sz="6" w:space="0"/>
+              <w:right w:val="single" w:color="D9D9D9" w:sz="6" w:space="0"/>
+            </w:tcBorders>
+            <w:vAlign w:val="center"/>
+          </w:tcPr>
+          <w:p>
+            <w:pPr>
+              <w:pStyle w:val="23"/>
+              <w:bidi w:val="0"/>
+              <w:spacing w:before="0" w:after="0" w:line="240" w:lineRule="auto"/>
+              <w:jc w:val="left"/>
+            </w:pPr>
+            <w:r>
+              <w:rPr>
+                <w:sz w:val="18"/>
+                <w:szCs w:val="18"/>
+              </w:rPr>
+              <w:t>RTL-SDR</w:t>
+            </w:r>
+          </w:p>
+        </w:tc>
+        <w:tc>
+          <w:tcPr>
+            <w:tcW w:w="2524" w:type="dxa"/>
+            <w:tcBorders>
+              <w:left w:val="single" w:color="D9D9D9" w:sz="2" w:space="0"/>
+              <w:bottom w:val="single" w:color="D9D9D9" w:sz="6" w:space="0"/>
+              <w:right w:val="single" w:color="D9D9D9" w:sz="6" w:space="0"/>
+            </w:tcBorders>
+            <w:vAlign w:val="center"/>
+          </w:tcPr>
+          <w:p>
+            <w:pPr>
+              <w:pStyle w:val="23"/>
+              <w:bidi w:val="0"/>
+              <w:spacing w:before="0" w:after="0" w:line="240" w:lineRule="auto"/>
+              <w:jc w:val="left"/>
+            </w:pPr>
+            <w:r>
+              <w:rPr>
+                <w:sz w:val="18"/>
+                <w:szCs w:val="18"/>
+              </w:rPr>
+              <w:t>Hasta ~2,4–3,2 Ms/s — SA, FM (2,4 Ms/s), LoRa y LTE 1,4 MHz. No admite WiFi ni BLE en vivo.</w:t>
+            </w:r>
+          </w:p>
+        </w:tc>
+        <w:tc>
+          <w:tcPr>
+            <w:tcW w:w="3671" w:type="dxa"/>
+            <w:tcBorders>
+              <w:left w:val="single" w:color="D9D9D9" w:sz="2" w:space="0"/>
+              <w:bottom w:val="single" w:color="D9D9D9" w:sz="6" w:space="0"/>
+              <w:right w:val="single" w:color="D9D9D9" w:sz="6" w:space="0"/>
+            </w:tcBorders>
+            <w:vAlign w:val="center"/>
+          </w:tcPr>
+          <w:p>
+            <w:pPr>
+              <w:pStyle w:val="23"/>
+              <w:bidi w:val="0"/>
+              <w:spacing w:before="0" w:after="0" w:line="240" w:lineRule="auto"/>
+              <w:jc w:val="left"/>
+            </w:pPr>
+            <w:r>
+              <w:rPr>
+                <w:sz w:val="18"/>
+                <w:szCs w:val="18"/>
+              </w:rPr>
+              <w:t>Ganancia única de sintonizador (dB) y control automático AGC.</w:t>
+            </w:r>
+          </w:p>
+        </w:tc>
+      </w:tr>
+      <w:tr>
+        <w:tblPrEx>
+          <w:tblCellMar>
+            <w:top w:w="75" w:type="dxa"/>
+            <w:left w:w="75" w:type="dxa"/>
+            <w:bottom w:w="75" w:type="dxa"/>
+            <w:right w:w="75" w:type="dxa"/>
+          </w:tblCellMar>
+        </w:tblPrEx>
+        <w:trPr>
+          <w:cantSplit/>
+        </w:trPr>
+        <w:tc>
+          <w:tcPr>
+            <w:tcW w:w="1453" w:type="dxa"/>
+            <w:tcBorders>
+              <w:left w:val="single" w:color="D9D9D9" w:sz="6" w:space="0"/>
+              <w:bottom w:val="single" w:color="D9D9D9" w:sz="6" w:space="0"/>
+              <w:right w:val="single" w:color="D9D9D9" w:sz="6" w:space="0"/>
+            </w:tcBorders>
+            <w:vAlign w:val="center"/>
+          </w:tcPr>
+          <w:p>
+            <w:pPr>
+              <w:pStyle w:val="23"/>
+              <w:bidi w:val="0"/>
+              <w:spacing w:before="0" w:after="0" w:line="240" w:lineRule="auto"/>
+              <w:jc w:val="left"/>
+            </w:pPr>
+            <w:r>
+              <w:rPr>
+                <w:sz w:val="18"/>
+                <w:szCs w:val="18"/>
+              </w:rPr>
+              <w:t>Nuand bladeRF x40</w:t>
+            </w:r>
+          </w:p>
+        </w:tc>
+        <w:tc>
+          <w:tcPr>
+            <w:tcW w:w="2524" w:type="dxa"/>
+            <w:tcBorders>
+              <w:left w:val="single" w:color="D9D9D9" w:sz="2" w:space="0"/>
+              <w:bottom w:val="single" w:color="D9D9D9" w:sz="6" w:space="0"/>
+              <w:right w:val="single" w:color="D9D9D9" w:sz="6" w:space="0"/>
+            </w:tcBorders>
+            <w:vAlign w:val="center"/>
+          </w:tcPr>
+          <w:p>
+            <w:pPr>
+              <w:pStyle w:val="23"/>
+              <w:bidi w:val="0"/>
+              <w:spacing w:before="0" w:after="0" w:line="240" w:lineRule="auto"/>
+              <w:jc w:val="left"/>
+            </w:pPr>
+            <w:r>
+              <w:rPr>
+                <w:sz w:val="18"/>
+                <w:szCs w:val="18"/>
+              </w:rPr>
+              <w:t>Hasta 20+ Ms/s — Todos los modos (SA, FM, LoRa, WiFi, BLE, LTE).</w:t>
+            </w:r>
+          </w:p>
+        </w:tc>
+        <w:tc>
+          <w:tcPr>
+            <w:tcW w:w="3671" w:type="dxa"/>
+            <w:tcBorders>
+              <w:left w:val="single" w:color="D9D9D9" w:sz="2" w:space="0"/>
+              <w:bottom w:val="single" w:color="D9D9D9" w:sz="6" w:space="0"/>
+              <w:right w:val="single" w:color="D9D9D9" w:sz="6" w:space="0"/>
+            </w:tcBorders>
+            <w:vAlign w:val="center"/>
+          </w:tcPr>
+          <w:p>
+            <w:pPr>
+              <w:pStyle w:val="23"/>
+              <w:bidi w:val="0"/>
+              <w:spacing w:before="0" w:after="0" w:line="240" w:lineRule="auto"/>
+              <w:jc w:val="left"/>
+            </w:pPr>
+            <w:r>
+              <w:rPr>
+                <w:sz w:val="18"/>
+                <w:szCs w:val="18"/>
+              </w:rPr>
+              <w:t>Etapas independientes LNA, RX VGA1 y RX VGA2.</w:t>
+            </w:r>
+          </w:p>
+        </w:tc>
+      </w:tr>
+      <w:tr>
+        <w:tblPrEx>
+          <w:tblCellMar>
+            <w:top w:w="75" w:type="dxa"/>
+            <w:left w:w="75" w:type="dxa"/>
+            <w:bottom w:w="75" w:type="dxa"/>
+            <w:right w:w="75" w:type="dxa"/>
+          </w:tblCellMar>
+        </w:tblPrEx>
+        <w:trPr>
+          <w:cantSplit/>
+        </w:trPr>
+        <w:tc>
+          <w:tcPr>
+            <w:tcW w:w="1453" w:type="dxa"/>
+            <w:tcBorders>
+              <w:left w:val="single" w:color="D9D9D9" w:sz="6" w:space="0"/>
+              <w:bottom w:val="single" w:color="D9D9D9" w:sz="6" w:space="0"/>
+              <w:right w:val="single" w:color="D9D9D9" w:sz="6" w:space="0"/>
+            </w:tcBorders>
+            <w:vAlign w:val="center"/>
+          </w:tcPr>
+          <w:p>
+            <w:pPr>
+              <w:pStyle w:val="23"/>
+              <w:bidi w:val="0"/>
+              <w:spacing w:before="0" w:after="0" w:line="240" w:lineRule="auto"/>
+              <w:jc w:val="left"/>
+            </w:pPr>
+            <w:r>
+              <w:rPr>
+                <w:sz w:val="18"/>
+                <w:szCs w:val="18"/>
+              </w:rPr>
+              <w:t>Ettus USRP B200</w:t>
+            </w:r>
+          </w:p>
+        </w:tc>
+        <w:tc>
+          <w:tcPr>
+            <w:tcW w:w="2524" w:type="dxa"/>
+            <w:tcBorders>
+              <w:left w:val="single" w:color="D9D9D9" w:sz="2" w:space="0"/>
+              <w:bottom w:val="single" w:color="D9D9D9" w:sz="6" w:space="0"/>
+              <w:right w:val="single" w:color="D9D9D9" w:sz="6" w:space="0"/>
+            </w:tcBorders>
+            <w:vAlign w:val="center"/>
+          </w:tcPr>
+          <w:p>
+            <w:pPr>
+              <w:pStyle w:val="23"/>
+              <w:bidi w:val="0"/>
+              <w:spacing w:before="0" w:after="0" w:line="240" w:lineRule="auto"/>
+              <w:jc w:val="left"/>
+            </w:pPr>
+            <w:r>
+              <w:rPr>
+                <w:sz w:val="18"/>
+                <w:szCs w:val="18"/>
+              </w:rPr>
+              <w:t>Hasta 20+ Ms/s — Todos los modos (SA, FM, LoRa, WiFi, BLE, LTE).</w:t>
+            </w:r>
+          </w:p>
+        </w:tc>
+        <w:tc>
+          <w:tcPr>
+            <w:tcW w:w="3671" w:type="dxa"/>
+            <w:tcBorders>
+              <w:left w:val="single" w:color="D9D9D9" w:sz="2" w:space="0"/>
+              <w:bottom w:val="single" w:color="D9D9D9" w:sz="6" w:space="0"/>
+              <w:right w:val="single" w:color="D9D9D9" w:sz="6" w:space="0"/>
+            </w:tcBorders>
+            <w:vAlign w:val="center"/>
+          </w:tcPr>
+          <w:p>
+            <w:pPr>
+              <w:pStyle w:val="23"/>
+              <w:bidi w:val="0"/>
+              <w:spacing w:before="0" w:after="0" w:line="240" w:lineRule="auto"/>
+              <w:jc w:val="left"/>
+            </w:pPr>
+            <w:r>
+              <w:rPr>
+                <w:sz w:val="18"/>
+                <w:szCs w:val="18"/>
+              </w:rPr>
+              <w:t>Ganancia global RX gestionada mediante UHD.</w:t>
+            </w:r>
+          </w:p>
+        </w:tc>
+      </w:tr>
+    </w:tbl>
     <w:p>
       <w:pPr>
         <w:pStyle w:val="5"/>
@@ -2797,6 +3806,38 @@
         <w:jc w:val="left"/>
       </w:pPr>
       <w:r>
+        <w:t>Recorte retrospectivo desde el espectrograma y exportación PNG</w:t>
+      </w:r>
+    </w:p>
+    <w:p>
+      <w:pPr>
+        <w:pStyle w:val="4"/>
+        <w:bidi w:val="0"/>
+        <w:jc w:val="left"/>
+      </w:pPr>
+      <w:r>
+        <w:t>Además de la grabación secuencial desde el menú Rec/Play, el panel del espectrograma permite capturar señales que acaban de aparecer en pantalla. Mientras la cascada está activa, IQRingBuffer conserva en memoria las muestras complejas correspondientes a la ventana temporal visible en el espectrograma.</w:t>
+      </w:r>
+    </w:p>
+    <w:p>
+      <w:pPr>
+        <w:pStyle w:val="4"/>
+        <w:bidi w:val="0"/>
+        <w:jc w:val="left"/>
+      </w:pPr>
+      <w:r>
+        <w:t>Al pulsar ✂️ Recortar Señal, la interfaz pausa la cascada y habilita una región horizontal sobre el eje de tiempo. Al confirmar el recorte, se extraen del buffer circular las muestras del intervalo seleccionado y se guardan en un archivo .npz (con raw_iq, center_freq y sample_rate), que puede volver a abrirse desde Rec/Play → Reproducir Archivo. El panel incluye también el botón Guardar Espectrograma para exportar la vista actual de la cascada como imagen .png.</w:t>
+      </w:r>
+    </w:p>
+    <w:p>
+      <w:pPr>
+        <w:pStyle w:val="6"/>
+        <w:keepNext/>
+        <w:keepLines/>
+        <w:bidi w:val="0"/>
+        <w:jc w:val="left"/>
+      </w:pPr>
+      <w:r>
         <w:t>Reproducir</w:t>
       </w:r>
     </w:p>
@@ -3142,7 +4183,7 @@
         <w:t>QT_QPA_PLATFORM=offscreen</w:t>
       </w:r>
       <w:r>
-        <w:t xml:space="preserve"> permite probar componentes de PyQt sin abrir ventanas. Para una prueba puntual, reemplazá </w:t>
+        <w:t xml:space="preserve"> permite probar componentes de PyQt sin abrir ventanas (con el entorno activo también basta ejecutar pytest -q desde la raíz gracias a la configuración en pyproject.toml). Para una prueba puntual, reemplazá </w:t>
       </w:r>
       <w:r>
         <w:rPr>
@@ -3152,13 +4193,13 @@
         <w:t>demodulador/tests</w:t>
       </w:r>
       <w:r>
-        <w:t xml:space="preserve"> por el archivo correspondiente. La ejecución local del 20 de octubre de 2026 terminó con </w:t>
+        <w:t xml:space="preserve"> por el archivo correspondiente. La ejecución local del 27 de octubre de 2026 terminó con </w:t>
       </w:r>
       <w:r>
         <w:rPr>
           <w:rStyle w:val="11"/>
         </w:rPr>
-        <w:t>129 pruebas aprobadas</w:t>
+        <w:t>132 pruebas aprobadas</w:t>
       </w:r>
       <w:r>
         <w:t>; ese número es una referencia fechada, no un valor fijo del proyecto.</w:t>
@@ -4648,7 +5689,7 @@
         <w:t>Mantener la aplicación como receptor y analizador.</w:t>
       </w:r>
       <w:r>
-        <w:t xml:space="preserve"> El HackRF se usa para recepción; el modo LoRa analiza la capa física. La red LoRaWAN con la LG01-P se desarrolla fuera de este repositorio.</w:t>
+        <w:t xml:space="preserve"> El HackRF se usa para recepción; el modo LoRa analiza la capa física.</w:t>
       </w:r>
     </w:p>
     <w:p>
@@ -4768,7 +5809,7 @@
         <w:t>Reiniciar el estado DSP al cortar o reemplazar el flujo IQ.</w:t>
       </w:r>
       <w:r>
-        <w:t xml:space="preserve"> Se descartan muestras y resultados antiguos para que el panel no mezcle sesiones; FM y LoRa también reinician su estado al resintonizar.</w:t>
+        <w:t xml:space="preserve"> Se descartan muestras y resultados antiguos para que el panel no mezcle sesiones, tanto en cortes de flujo como al resintonizar o cambiar la tasa de muestreo en cualquier modo.</w:t>
       </w:r>
     </w:p>
     <w:p>
@@ -4849,6 +5890,83 @@
       </w:pPr>
       <w:r>
         <w:t xml:space="preserve">Documentar ajustes de antena, ganancia y entorno junto a futuras capturas RF de referencia; esos datos no se guardan en el JSON actual. </w:t>
+      </w:r>
+    </w:p>
+    <w:p>
+      <w:pPr>
+        <w:pStyle w:val="5"/>
+        <w:keepNext/>
+        <w:keepLines/>
+        <w:bidi w:val="0"/>
+        <w:ind w:left="0" w:right="0" w:firstLine="0"/>
+        <w:jc w:val="left"/>
+      </w:pPr>
+      <w:r>
+        <w:t>Resolución de problemas frecuentes</w:t>
+      </w:r>
+    </w:p>
+    <w:p>
+      <w:pPr>
+        <w:pStyle w:val="28"/>
+        <w:bidi w:val="0"/>
+        <w:jc w:val="left"/>
+      </w:pPr>
+      <w:r>
+        <w:rPr>
+          <w:rStyle w:val="11"/>
+        </w:rPr>
+        <w:t>El SDR no aparece en la ventana de inicio:</w:t>
+      </w:r>
+      <w:r>
+        <w:t xml:space="preserve"> verificá que las reglas udev estén instaladas en /etc/udev/rules.d/ y recargadas (sudo udevadm control --reload-rules &amp;&amp; sudo udevadm trigger), y desconectá/reconectá el equipo USB.</w:t>
+      </w:r>
+    </w:p>
+    <w:p>
+      <w:pPr>
+        <w:pStyle w:val="28"/>
+        <w:bidi w:val="0"/>
+        <w:jc w:val="left"/>
+      </w:pPr>
+      <w:r>
+        <w:rPr>
+          <w:rStyle w:val="11"/>
+        </w:rPr>
+        <w:t>Error de FPGA o imágenes al abrir bladeRF o USRP B200:</w:t>
+      </w:r>
+      <w:r>
+        <w:t xml:space="preserve"> bladeRF x40 requiere el bitstream /usr/share/Nuand/bladeRF/hostedx40.rbf y USRP B200 requiere las imágenes descargadas mediante uhd_images_downloader (ambos pasos están automatizados en setup.sh).</w:t>
+      </w:r>
+    </w:p>
+    <w:p>
+      <w:pPr>
+        <w:pStyle w:val="28"/>
+        <w:bidi w:val="0"/>
+        <w:jc w:val="left"/>
+      </w:pPr>
+      <w:r>
+        <w:rPr>
+          <w:rStyle w:val="11"/>
+        </w:rPr>
+        <w:t>Cortes de audio (underruns) en FM: escucha:</w:t>
+      </w:r>
+      <w:r>
+        <w:t xml:space="preserve"> reducí el tamaño de FFT o desactivá temporalmente el espectrograma si la CPU se satura; AudioManager reporta los underruns y descarta bloques antiguos si la cola supera su latencia máxima.</w:t>
+      </w:r>
+    </w:p>
+    <w:p>
+      <w:pPr>
+        <w:pStyle w:val="28"/>
+        <w:bidi w:val="0"/>
+        <w:jc w:val="left"/>
+      </w:pPr>
+      <w:r>
+        <w:rPr>
+          <w:rStyle w:val="11"/>
+        </w:rPr>
+        <w:t>Grabación descartada automáticamente:</w:t>
+      </w:r>
+      <w:r>
+        <w:t xml:space="preserve"> durante la grabación, IQRecorder invalida la captura si el controlador SDR informa pérdida de continuidad o si la cola de escritura en disco se llena. Usá un disco local rápido y evitá concentradores USB compartidos a 20 Ms/s.</w:t>
       </w:r>
     </w:p>
     <w:sectPr>

</xml_diff>